<commit_message>
Modalidad virtual sincrona en los 4 cursos y material regenerado desde la fuente
</commit_message>
<xml_diff>
--- a/Programacion II/Clases/Clase 1 - Introduccion a POO/Taller PI - Clase 1 - VetCare.docx
+++ b/Programacion II/Clases/Clase 1 - Introduccion a POO/Taller PI - Clase 1 - VetCare.docx
@@ -680,7 +680,7 @@
           <w:color w:val="2B2B2B"/>
           <w:sz w:val="22"/>
         </w:rPr>
-        <w:t>El diagrama se escribe como texto en sintaxis Mermaid y la plataforma lo dibuja al instante. No hay que exportar imagenes ni salir a otra herramienta.</w:t>
+        <w:t>El diagrama se escribe como texto en sintaxis Mermaid y la plataforma lo dibuja al instante: no se sube una imagen. Puedes disenarlo primero a mano en Excalidraw o draw.io y pedirle a una IA que lo traduzca a Mermaid (ver «Del boceto al codigo Mermaid» mas abajo).</w:t>
       </w:r>
     </w:p>
     <w:p>
@@ -716,6 +716,128 @@
           <w:sz w:val="22"/>
         </w:rPr>
         <w:t>Un cuadro de texto. Se escribe directamente en la plataforma; no se sube archivo.</w:t>
+      </w:r>
+    </w:p>
+    <w:p>
+      <w:pPr>
+        <w:spacing w:after="120"/>
+      </w:pPr>
+      <w:r>
+        <w:rPr>
+          <w:rFonts w:ascii="Calibri" w:hAnsi="Calibri" w:eastAsia="Calibri"/>
+          <w:b/>
+          <w:color w:val="095292"/>
+          <w:sz w:val="22"/>
+        </w:rPr>
+        <w:t>Del boceto al codigo Mermaid</w:t>
+      </w:r>
+    </w:p>
+    <w:p>
+      <w:pPr>
+        <w:spacing w:after="120"/>
+      </w:pPr>
+      <w:r>
+        <w:rPr>
+          <w:rFonts w:ascii="Calibri" w:hAnsi="Calibri" w:eastAsia="Calibri"/>
+          <w:b w:val="0"/>
+          <w:color w:val="2B2B2B"/>
+          <w:sz w:val="22"/>
+        </w:rPr>
+        <w:t>La pregunta de diagrama NO recibe imagenes: se responde con codigo Mermaid (`classDiagram`) que la plataforma dibuja al instante. No tienes que escribirlo de memoria; el camino corto es este:</w:t>
+      </w:r>
+    </w:p>
+    <w:p>
+      <w:r>
+        <w:rPr>
+          <w:rFonts w:ascii="Calibri" w:hAnsi="Calibri" w:eastAsia="Calibri"/>
+          <w:b/>
+          <w:color w:val="2B2B2B"/>
+          <w:sz w:val="22"/>
+        </w:rPr>
+        <w:t>1. Disena visual:</w:t>
+      </w:r>
+      <w:r>
+        <w:rPr>
+          <w:rFonts w:ascii="Calibri" w:hAnsi="Calibri" w:eastAsia="Calibri"/>
+          <w:b w:val="0"/>
+          <w:color w:val="2B2B2B"/>
+          <w:sz w:val="22"/>
+        </w:rPr>
+        <w:t xml:space="preserve"> Dibuja el diagrama como quieras en Excalidraw o draw.io: es mas rapido arrastrar cajas que escribir codigo, y ahi es donde piensas el modelo.</w:t>
+      </w:r>
+    </w:p>
+    <w:p>
+      <w:r>
+        <w:rPr>
+          <w:rFonts w:ascii="Calibri" w:hAnsi="Calibri" w:eastAsia="Calibri"/>
+          <w:b/>
+          <w:color w:val="2B2B2B"/>
+          <w:sz w:val="22"/>
+        </w:rPr>
+        <w:t>2. Traduce con IA:</w:t>
+      </w:r>
+      <w:r>
+        <w:rPr>
+          <w:rFonts w:ascii="Calibri" w:hAnsi="Calibri" w:eastAsia="Calibri"/>
+          <w:b w:val="0"/>
+          <w:color w:val="2B2B2B"/>
+          <w:sz w:val="22"/>
+        </w:rPr>
+        <w:t xml:space="preserve"> Copia o describe tu boceto a una IA y pidele el codigo Mermaid: «convierte este diagrama a Mermaid usando `classDiagram`». Revisa el resultado: la IA acierta la sintaxis, no tu modelo.</w:t>
+      </w:r>
+    </w:p>
+    <w:p>
+      <w:r>
+        <w:rPr>
+          <w:rFonts w:ascii="Calibri" w:hAnsi="Calibri" w:eastAsia="Calibri"/>
+          <w:b/>
+          <w:color w:val="2B2B2B"/>
+          <w:sz w:val="22"/>
+        </w:rPr>
+        <w:t>3. Pega y renderiza en ExamLab:</w:t>
+      </w:r>
+      <w:r>
+        <w:rPr>
+          <w:rFonts w:ascii="Calibri" w:hAnsi="Calibri" w:eastAsia="Calibri"/>
+          <w:b w:val="0"/>
+          <w:color w:val="2B2B2B"/>
+          <w:sz w:val="22"/>
+        </w:rPr>
+        <w:t xml:space="preserve"> Pega ese codigo en la caja de texto de la pregunta y mira como lo dibuja la plataforma. Si no renderiza, corrige ahi mismo: lo que se califica es el diagrama renderizado dentro de ExamLab.</w:t>
+      </w:r>
+    </w:p>
+    <w:p>
+      <w:r>
+        <w:rPr>
+          <w:rFonts w:ascii="Calibri" w:hAnsi="Calibri" w:eastAsia="Calibri"/>
+          <w:b/>
+          <w:color w:val="2B2B2B"/>
+          <w:sz w:val="22"/>
+        </w:rPr>
+        <w:t>4. Guarda el PNG para tu PI:</w:t>
+      </w:r>
+      <w:r>
+        <w:rPr>
+          <w:rFonts w:ascii="Calibri" w:hAnsi="Calibri" w:eastAsia="Calibri"/>
+          <w:b w:val="0"/>
+          <w:color w:val="2B2B2B"/>
+          <w:sz w:val="22"/>
+        </w:rPr>
+        <w:t xml:space="preserve"> Exporta tambien la imagen a la carpeta de tu Proyecto Integrador. Esa copia es para tu informe; no reemplaza la respuesta en la plataforma.</w:t>
+      </w:r>
+    </w:p>
+    <w:p>
+      <w:pPr>
+        <w:spacing w:after="120"/>
+      </w:pPr>
+      <w:r>
+        <w:rPr>
+          <w:rFonts w:ascii="Calibri" w:hAnsi="Calibri" w:eastAsia="Calibri"/>
+          <w:b w:val="0"/>
+          <w:color w:val="2B2B2B"/>
+          <w:sz w:val="22"/>
+        </w:rPr>
+        <w:t>Si la IA te devuelve algo que no renderiza, no lo pegues tal cual: corrigelo en ExamLab hasta ver el dibujo. Un diagrama que no renderiza no se puede calificar.</w:t>
       </w:r>
     </w:p>
     <w:p>

</xml_diff>